<commit_message>
feat: :ambulance: Uploaded docs
</commit_message>
<xml_diff>
--- a/reports/Group/00 - Requirements - Group.docx
+++ b/reports/Group/00 - Requirements - Group.docx
@@ -2249,7 +2249,13 @@
         </w:sdtPr>
         <w:sdtContent>
           <w:r>
-            <w:t xml:space="preserve">    </w:t>
+            <w:t xml:space="preserve">  </w:t>
+          </w:r>
+          <w:r>
+            <w:t>X</w:t>
+          </w:r>
+          <w:r>
+            <w:t xml:space="preserve">  </w:t>
           </w:r>
         </w:sdtContent>
       </w:sdt>
@@ -2421,7 +2427,13 @@
         </w:sdtPr>
         <w:sdtContent>
           <w:r>
-            <w:t xml:space="preserve">    </w:t>
+            <w:t xml:space="preserve">  </w:t>
+          </w:r>
+          <w:r>
+            <w:t>X</w:t>
+          </w:r>
+          <w:r>
+            <w:t xml:space="preserve">  </w:t>
           </w:r>
         </w:sdtContent>
       </w:sdt>
@@ -2633,7 +2645,13 @@
         </w:sdtPr>
         <w:sdtContent>
           <w:r>
-            <w:t xml:space="preserve">    </w:t>
+            <w:t xml:space="preserve">  </w:t>
+          </w:r>
+          <w:r>
+            <w:t>X</w:t>
+          </w:r>
+          <w:r>
+            <w:t xml:space="preserve">  </w:t>
           </w:r>
         </w:sdtContent>
       </w:sdt>
@@ -2823,7 +2841,13 @@
         </w:sdtPr>
         <w:sdtContent>
           <w:r>
-            <w:t xml:space="preserve">    </w:t>
+            <w:t xml:space="preserve">  </w:t>
+          </w:r>
+          <w:r>
+            <w:t>X</w:t>
+          </w:r>
+          <w:r>
+            <w:t xml:space="preserve">  </w:t>
           </w:r>
         </w:sdtContent>
       </w:sdt>
@@ -3060,7 +3084,13 @@
         </w:sdtPr>
         <w:sdtContent>
           <w:r>
-            <w:t xml:space="preserve">    </w:t>
+            <w:t xml:space="preserve">  </w:t>
+          </w:r>
+          <w:r>
+            <w:t>X</w:t>
+          </w:r>
+          <w:r>
+            <w:t xml:space="preserve">  </w:t>
           </w:r>
         </w:sdtContent>
       </w:sdt>
@@ -3188,7 +3218,13 @@
         </w:sdtPr>
         <w:sdtContent>
           <w:r>
-            <w:t xml:space="preserve">    </w:t>
+            <w:t xml:space="preserve">  </w:t>
+          </w:r>
+          <w:r>
+            <w:t>X</w:t>
+          </w:r>
+          <w:r>
+            <w:t xml:space="preserve">  </w:t>
           </w:r>
         </w:sdtContent>
       </w:sdt>
@@ -3260,7 +3296,13 @@
         </w:sdtPr>
         <w:sdtContent>
           <w:r>
-            <w:t xml:space="preserve">    </w:t>
+            <w:t xml:space="preserve">  </w:t>
+          </w:r>
+          <w:r>
+            <w:t>X</w:t>
+          </w:r>
+          <w:r>
+            <w:t xml:space="preserve">  </w:t>
           </w:r>
         </w:sdtContent>
       </w:sdt>
@@ -4754,7 +4796,13 @@
         </w:sdtPr>
         <w:sdtContent>
           <w:r>
-            <w:t xml:space="preserve">    </w:t>
+            <w:t xml:space="preserve">  </w:t>
+          </w:r>
+          <w:r>
+            <w:t>X</w:t>
+          </w:r>
+          <w:r>
+            <w:t xml:space="preserve">  </w:t>
           </w:r>
         </w:sdtContent>
       </w:sdt>
@@ -11099,8 +11147,10 @@
     <w:rsid w:val="00117B5F"/>
     <w:rsid w:val="00175D09"/>
     <w:rsid w:val="00185460"/>
+    <w:rsid w:val="00187EA0"/>
     <w:rsid w:val="001942D6"/>
     <w:rsid w:val="001C5FFF"/>
+    <w:rsid w:val="00256794"/>
     <w:rsid w:val="00260AAC"/>
     <w:rsid w:val="00336824"/>
     <w:rsid w:val="00364D10"/>

</xml_diff>

<commit_message>
docs: :memo: Add Requirements Student3 and Requirement Group
</commit_message>
<xml_diff>
--- a/reports/Group/00 - Requirements - Group.docx
+++ b/reports/Group/00 - Requirements - Group.docx
@@ -3084,13 +3084,13 @@
         </w:sdtPr>
         <w:sdtContent>
           <w:r>
-            <w:t xml:space="preserve">  </w:t>
+            <w:t xml:space="preserve"> </w:t>
           </w:r>
           <w:r>
             <w:t>X</w:t>
           </w:r>
           <w:r>
-            <w:t xml:space="preserve">  </w:t>
+            <w:t xml:space="preserve">   </w:t>
           </w:r>
         </w:sdtContent>
       </w:sdt>
@@ -3462,7 +3462,13 @@
         </w:sdtPr>
         <w:sdtContent>
           <w:r>
-            <w:t xml:space="preserve">    </w:t>
+            <w:t xml:space="preserve"> </w:t>
+          </w:r>
+          <w:r>
+            <w:t>X</w:t>
+          </w:r>
+          <w:r>
+            <w:t xml:space="preserve">   </w:t>
           </w:r>
         </w:sdtContent>
       </w:sdt>
@@ -3547,7 +3553,13 @@
         </w:sdtPr>
         <w:sdtContent>
           <w:r>
-            <w:t xml:space="preserve">    </w:t>
+            <w:t xml:space="preserve">  </w:t>
+          </w:r>
+          <w:r>
+            <w:t>X</w:t>
+          </w:r>
+          <w:r>
+            <w:t xml:space="preserve">  </w:t>
           </w:r>
         </w:sdtContent>
       </w:sdt>
@@ -3632,7 +3644,13 @@
         </w:sdtPr>
         <w:sdtContent>
           <w:r>
-            <w:t xml:space="preserve">    </w:t>
+            <w:t xml:space="preserve"> </w:t>
+          </w:r>
+          <w:r>
+            <w:t>X</w:t>
+          </w:r>
+          <w:r>
+            <w:t xml:space="preserve">   </w:t>
           </w:r>
         </w:sdtContent>
       </w:sdt>
@@ -3706,7 +3724,13 @@
         </w:sdtPr>
         <w:sdtContent>
           <w:r>
-            <w:t xml:space="preserve">    </w:t>
+            <w:t xml:space="preserve">  </w:t>
+          </w:r>
+          <w:r>
+            <w:t>X</w:t>
+          </w:r>
+          <w:r>
+            <w:t xml:space="preserve">  </w:t>
           </w:r>
         </w:sdtContent>
       </w:sdt>
@@ -4237,13 +4261,13 @@
         </w:sdtPr>
         <w:sdtContent>
           <w:r>
-            <w:t xml:space="preserve">  </w:t>
+            <w:t xml:space="preserve"> </w:t>
           </w:r>
           <w:r>
             <w:t>X</w:t>
           </w:r>
           <w:r>
-            <w:t xml:space="preserve">  </w:t>
+            <w:t xml:space="preserve">   </w:t>
           </w:r>
         </w:sdtContent>
       </w:sdt>
@@ -4316,13 +4340,7 @@
         </w:sdtPr>
         <w:sdtContent>
           <w:r>
-            <w:t xml:space="preserve">  </w:t>
-          </w:r>
-          <w:r>
-            <w:t>X</w:t>
-          </w:r>
-          <w:r>
-            <w:t xml:space="preserve">  </w:t>
+            <w:t xml:space="preserve">    </w:t>
           </w:r>
         </w:sdtContent>
       </w:sdt>
@@ -4356,13 +4374,7 @@
         </w:sdtPr>
         <w:sdtContent>
           <w:r>
-            <w:t xml:space="preserve">  </w:t>
-          </w:r>
-          <w:r>
-            <w:t>X</w:t>
-          </w:r>
-          <w:r>
-            <w:t xml:space="preserve">  </w:t>
+            <w:t xml:space="preserve">    </w:t>
           </w:r>
         </w:sdtContent>
       </w:sdt>
@@ -4796,13 +4808,13 @@
         </w:sdtPr>
         <w:sdtContent>
           <w:r>
-            <w:t xml:space="preserve">  </w:t>
+            <w:t xml:space="preserve"> </w:t>
           </w:r>
           <w:r>
             <w:t>X</w:t>
           </w:r>
           <w:r>
-            <w:t xml:space="preserve">  </w:t>
+            <w:t xml:space="preserve">   </w:t>
           </w:r>
         </w:sdtContent>
       </w:sdt>
@@ -11147,10 +11159,8 @@
     <w:rsid w:val="00117B5F"/>
     <w:rsid w:val="00175D09"/>
     <w:rsid w:val="00185460"/>
-    <w:rsid w:val="00187EA0"/>
     <w:rsid w:val="001942D6"/>
     <w:rsid w:val="001C5FFF"/>
-    <w:rsid w:val="00256794"/>
     <w:rsid w:val="00260AAC"/>
     <w:rsid w:val="00336824"/>
     <w:rsid w:val="00364D10"/>
@@ -11166,6 +11176,7 @@
     <w:rsid w:val="004B6C76"/>
     <w:rsid w:val="004C0766"/>
     <w:rsid w:val="004E7F77"/>
+    <w:rsid w:val="005412BE"/>
     <w:rsid w:val="00562343"/>
     <w:rsid w:val="005640FA"/>
     <w:rsid w:val="005A320F"/>
@@ -11178,7 +11189,6 @@
     <w:rsid w:val="006979C5"/>
     <w:rsid w:val="006B2BEC"/>
     <w:rsid w:val="006F209A"/>
-    <w:rsid w:val="00740144"/>
     <w:rsid w:val="00765401"/>
     <w:rsid w:val="00786DEE"/>
     <w:rsid w:val="00790E22"/>
@@ -11188,6 +11198,7 @@
     <w:rsid w:val="008B2B2C"/>
     <w:rsid w:val="008E4C14"/>
     <w:rsid w:val="0093034B"/>
+    <w:rsid w:val="00940F51"/>
     <w:rsid w:val="00946AA5"/>
     <w:rsid w:val="00953D97"/>
     <w:rsid w:val="009F61B1"/>
@@ -11199,7 +11210,6 @@
     <w:rsid w:val="00A73E76"/>
     <w:rsid w:val="00AC1FAB"/>
     <w:rsid w:val="00B55352"/>
-    <w:rsid w:val="00B86CEB"/>
     <w:rsid w:val="00BB0EAB"/>
     <w:rsid w:val="00C06868"/>
     <w:rsid w:val="00C17266"/>

</xml_diff>